<commit_message>
Add group metadata to diploma documents
</commit_message>
<xml_diff>
--- a/docs/diploma/Бахитияр_Санжар_дипломдық_жоба_құжаттамасы.docx
+++ b/docs/diploma/Бахитияр_Санжар_дипломдық_жоба_құжаттамасы.docx
@@ -167,6 +167,21 @@
           <w:sz w:val="28"/>
         </w:rPr>
         <w:t>ҚР APC 06130100 ДЖ ТХ</w:t>
+      </w:r>
+    </w:p>
+    <w:p>
+      <w:pPr>
+        <w:spacing w:line="360" w:lineRule="auto" w:after="60"/>
+        <w:jc w:val="center"/>
+      </w:pPr>
+      <w:r>
+        <w:rPr>
+          <w:rFonts w:ascii="Times New Roman" w:hAnsi="Times New Roman" w:eastAsia="Times New Roman" w:cs="Times New Roman"/>
+          <w:b/>
+          <w:i w:val="0"/>
+          <w:sz w:val="28"/>
+        </w:rPr>
+        <w:t>Орындаған: П22-4Б тобының студенті Бахитияр Санжар</w:t>
       </w:r>
     </w:p>
     <w:p/>

</xml_diff>

<commit_message>
docs: add full Kazakh diploma explanatory note for tarbie; remove WhatsApp refs
- Add Бахитияр_Санжар_түсіндірме_жазба.docx: complete 58-page пояснительная записка (Times New Roman 14, ГОСТ formatting, auto-paginated МАЗМҰНЫ) covering intro, general, special, economic, labor-safety parts, conclusion, references and source-code appendices for the Тәрбие Сағаты system.
- Strip all WhatsApp references from existing project docs (keep Telegram only): пікір/рецензия, дипломдық жоба құжаттамасы, and the root Russian documentation.
</commit_message>
<xml_diff>
--- a/docs/diploma/Бахитияр_Санжар_дипломдық_жоба_құжаттамасы.docx
+++ b/docs/diploma/Бахитияр_Санжар_дипломдық_жоба_құжаттамасы.docx
@@ -995,7 +995,7 @@
           <w:i w:val="0"/>
           <w:sz w:val="28"/>
         </w:rPr>
-        <w:t>– Telegram/WhatsApp хабарламалары, AI-көмекші және есеп беру модульдерін қарастыру;</w:t>
+        <w:t>– Telegram хабарламалары, AI-көмекші және есеп беру модульдерін қарастыру;</w:t>
       </w:r>
     </w:p>
     <w:p>
@@ -1553,7 +1553,7 @@
           <w:i w:val="0"/>
           <w:sz w:val="28"/>
         </w:rPr>
-        <w:t>Осы дипломдық жобада ұсынылатын ақпараттық жүйе тәрбие сағатын электронды түрде жоспарлау, бекіту, басқару және есепке алу процесін автоматтандыруға бағытталған. Жүйе әкімшіге, кураторға және студентке арналған рөлдік интерфейстерді, тәрбие сағатының мәртебелерін, Word-құжат жүктеу мен электронды қолтаңба қою механизмін, Telegram/WhatsApp хабарламаларын, есеп беру модулін және AI-көмекшіні біріктіреді.</w:t>
+        <w:t>Осы дипломдық жобада ұсынылатын ақпараттық жүйе тәрбие сағатын электронды түрде жоспарлау, бекіту, басқару және есепке алу процесін автоматтандыруға бағытталған. Жүйе әкімшіге, кураторға және студентке арналған рөлдік интерфейстерді, тәрбие сағатының мәртебелерін, Word-құжат жүктеу мен электронды қолтаңба қою механизмін, Telegram хабарламаларын, есеп беру модулін және AI-көмекшіні біріктіреді.</w:t>
       </w:r>
     </w:p>
     <w:p>
@@ -2157,7 +2157,7 @@
                 <w:i w:val="0"/>
                 <w:sz w:val="28"/>
               </w:rPr>
-              <w:t>Telegram/WhatsApp арқылы еске салу және мәртебе хабарламалары</w:t>
+              <w:t>Telegram арқылы еске салу және мәртебе хабарламалары</w:t>
             </w:r>
           </w:p>
         </w:tc>
@@ -3531,7 +3531,7 @@
                 <w:i w:val="0"/>
                 <w:sz w:val="28"/>
               </w:rPr>
-              <w:t>Telegram/WhatsApp хабарламаларын жіберу</w:t>
+              <w:t>Telegram хабарламаларын жіберу</w:t>
             </w:r>
           </w:p>
         </w:tc>
@@ -4033,7 +4033,7 @@
                 <w:i w:val="0"/>
                 <w:sz w:val="28"/>
               </w:rPr>
-              <w:t>Telegram/WhatsApp webhook және хабарлама consumer</w:t>
+              <w:t>Telegram webhook және хабарлама consumer</w:t>
             </w:r>
           </w:p>
         </w:tc>
@@ -6274,7 +6274,7 @@
           <w:i w:val="0"/>
           <w:sz w:val="28"/>
         </w:rPr>
-        <w:t>Telegram бот /start, /my_sessions және /confirm командаларын өңдейді. Бот куратор мен студентке алдағы тәрбие сағаттары туралы хабарлама жіберіп, сабақ мәртебесін жылдам растауға мүмкіндік береді. WhatsApp Business Cloud API интеграциясы да қарастырылған.</w:t>
+        <w:t>Telegram бот /start, /my_sessions және /confirm командаларын өңдейді. Бот куратор мен студентке алдағы тәрбие сағаттары туралы хабарлама жіберіп, сабақ мәртебесін жылдам растауға мүмкіндік береді.</w:t>
       </w:r>
     </w:p>
     <w:p>
@@ -7712,6 +7712,8 @@
       </w:r>
     </w:p>
     <w:sectPr>
+      <w:headerReference w:type="default" r:id="rId9"/>
+      <w:footerReference w:type="default" r:id="rId10"/>
       <w:pgSz w:w="12240" w:h="15840"/>
       <w:pgMar w:top="1134" w:right="850" w:bottom="1134" w:left="1701" w:header="720" w:footer="720" w:gutter="0"/>
       <w:cols w:space="720"/>
@@ -7719,6 +7721,26 @@
     </w:sectPr>
   </w:body>
 </w:document>
+</file>
+
+<file path=word/footer1.xml><?xml version="1.0" encoding="utf-8"?>
+<w:ftr xmlns:m="http://schemas.openxmlformats.org/officeDocument/2006/math" xmlns:mc="http://schemas.openxmlformats.org/markup-compatibility/2006" xmlns:mo="http://schemas.microsoft.com/office/mac/office/2008/main" xmlns:mv="urn:schemas-microsoft-com:mac:vml" xmlns:o="urn:schemas-microsoft-com:office:office" xmlns:r="http://schemas.openxmlformats.org/officeDocument/2006/relationships" xmlns:v="urn:schemas-microsoft-com:vml" xmlns:w10="urn:schemas-microsoft-com:office:word" xmlns:w14="http://schemas.microsoft.com/office/word/2010/wordml" xmlns:w="http://schemas.openxmlformats.org/wordprocessingml/2006/main" xmlns:wne="http://schemas.microsoft.com/office/word/2006/wordml" xmlns:wp14="http://schemas.microsoft.com/office/word/2010/wordprocessingDrawing" xmlns:wp="http://schemas.openxmlformats.org/drawingml/2006/wordprocessingDrawing" xmlns:wpc="http://schemas.microsoft.com/office/word/2010/wordprocessingCanvas" xmlns:wpg="http://schemas.microsoft.com/office/word/2010/wordprocessingGroup" xmlns:wpi="http://schemas.microsoft.com/office/word/2010/wordprocessingInk" xmlns:wps="http://schemas.microsoft.com/office/word/2010/wordprocessingShape" mc:Ignorable="w14 wp14">
+  <w:p>
+    <w:pPr>
+      <w:pStyle w:val="Footer"/>
+    </w:pPr>
+  </w:p>
+</w:ftr>
+</file>
+
+<file path=word/header1.xml><?xml version="1.0" encoding="utf-8"?>
+<w:hdr xmlns:m="http://schemas.openxmlformats.org/officeDocument/2006/math" xmlns:mc="http://schemas.openxmlformats.org/markup-compatibility/2006" xmlns:mo="http://schemas.microsoft.com/office/mac/office/2008/main" xmlns:mv="urn:schemas-microsoft-com:mac:vml" xmlns:o="urn:schemas-microsoft-com:office:office" xmlns:r="http://schemas.openxmlformats.org/officeDocument/2006/relationships" xmlns:v="urn:schemas-microsoft-com:vml" xmlns:w10="urn:schemas-microsoft-com:office:word" xmlns:w14="http://schemas.microsoft.com/office/word/2010/wordml" xmlns:w="http://schemas.openxmlformats.org/wordprocessingml/2006/main" xmlns:wne="http://schemas.microsoft.com/office/word/2006/wordml" xmlns:wp14="http://schemas.microsoft.com/office/word/2010/wordprocessingDrawing" xmlns:wp="http://schemas.openxmlformats.org/drawingml/2006/wordprocessingDrawing" xmlns:wpc="http://schemas.microsoft.com/office/word/2010/wordprocessingCanvas" xmlns:wpg="http://schemas.microsoft.com/office/word/2010/wordprocessingGroup" xmlns:wpi="http://schemas.microsoft.com/office/word/2010/wordprocessingInk" xmlns:wps="http://schemas.microsoft.com/office/word/2010/wordprocessingShape" mc:Ignorable="w14 wp14">
+  <w:p>
+    <w:pPr>
+      <w:pStyle w:val="Header"/>
+    </w:pPr>
+  </w:p>
+</w:hdr>
 </file>
 
 <file path=word/numbering.xml><?xml version="1.0" encoding="utf-8"?>

</xml_diff>